<commit_message>
Ingreso diario total, plantillas editables, informe semanal y mejoras de dashboard
Modelo daily_totals con FK a services, carga manual y por pegado con auto-registro de servicios (codigo/abreviacion), dashboard con circular/barras/tendencia/tabla, informe .docx con marcas de totales en alta resolucion, modulo de plantillas con inspector y edicion, vista PDF exacta, seeders y squash de migraciones
</commit_message>
<xml_diff>
--- a/assets/templates/plantilla-sistema.docx
+++ b/assets/templates/plantilla-sistema.docx
@@ -580,6 +580,30 @@
           <w:lang w:val="es-ES"/>
         </w:rPr>
       </w:pPr>
+      <w:r>
+        <w:rPr>
+          <w:b/>
+          <w:bCs/>
+          <w:lang w:val="es-ES"/>
+        </w:rPr>
+        <w:t>{</w:t>
+      </w:r>
+      <w:r>
+        <w:rPr>
+          <w:b/>
+          <w:bCs/>
+          <w:lang w:val="es-ES"/>
+        </w:rPr>
+        <w:t>TABLA_INGRESO</w:t>
+      </w:r>
+      <w:r>
+        <w:rPr>
+          <w:b/>
+          <w:bCs/>
+          <w:lang w:val="es-ES"/>
+        </w:rPr>
+        <w:t>}</w:t>
+      </w:r>
     </w:p>
     <w:p>
       <w:pPr>
@@ -604,7 +628,15 @@
           <w:bCs/>
           <w:lang w:val="es-ES"/>
         </w:rPr>
-        <w:t>TABLA_INGRESO</w:t>
+        <w:t>GRAFICO</w:t>
+      </w:r>
+      <w:r>
+        <w:rPr>
+          <w:b/>
+          <w:bCs/>
+          <w:lang w:val="es-ES"/>
+        </w:rPr>
+        <w:t>_DISTRIBUCION_TRAMITE</w:t>
       </w:r>
       <w:r>
         <w:rPr>
@@ -624,6 +656,30 @@
           <w:lang w:val="es-ES"/>
         </w:rPr>
       </w:pPr>
+      <w:r>
+        <w:rPr>
+          <w:b/>
+          <w:bCs/>
+          <w:lang w:val="es-ES"/>
+        </w:rPr>
+        <w:t>{GRAFICO_</w:t>
+      </w:r>
+      <w:r>
+        <w:rPr>
+          <w:b/>
+          <w:bCs/>
+          <w:lang w:val="es-ES"/>
+        </w:rPr>
+        <w:t>TOTAL_TRAMITE</w:t>
+      </w:r>
+      <w:r>
+        <w:rPr>
+          <w:b/>
+          <w:bCs/>
+          <w:lang w:val="es-ES"/>
+        </w:rPr>
+        <w:t>}</w:t>
+      </w:r>
     </w:p>
     <w:p>
       <w:pPr>
@@ -640,15 +696,15 @@
           <w:bCs/>
           <w:lang w:val="es-ES"/>
         </w:rPr>
-        <w:t>{</w:t>
-      </w:r>
-      <w:r>
-        <w:rPr>
-          <w:b/>
-          <w:bCs/>
-          <w:lang w:val="es-ES"/>
-        </w:rPr>
-        <w:t>GRAFICO_INGRESO</w:t>
+        <w:t>{GRAFICO_</w:t>
+      </w:r>
+      <w:r>
+        <w:rPr>
+          <w:b/>
+          <w:bCs/>
+          <w:lang w:val="es-ES"/>
+        </w:rPr>
+        <w:t>TENDENCIA_DIA</w:t>
       </w:r>
       <w:r>
         <w:rPr>
@@ -661,195 +717,16 @@
     </w:p>
     <w:p>
       <w:pPr>
-        <w:rPr>
-          <w:rFonts w:ascii="Calibri" w:hAnsi="Calibri" w:cs="Arial"/>
-          <w:b/>
-          <w:bCs/>
-        </w:rPr>
-      </w:pPr>
-    </w:p>
-    <w:p>
-      <w:pPr>
-        <w:spacing w:after="0"/>
         <w:jc w:val="center"/>
         <w:rPr>
-          <w:rFonts w:ascii="Calibri" w:hAnsi="Calibri" w:cs="Arial"/>
-          <w:b/>
-          <w:bCs/>
-        </w:rPr>
-      </w:pPr>
-      <w:r>
-        <w:rPr>
-          <w:rFonts w:ascii="Calibri" w:hAnsi="Calibri" w:cs="Arial"/>
-          <w:b/>
-          <w:bCs/>
-        </w:rPr>
-        <w:t xml:space="preserve">REPORTE DE VEHÍCULOS - RESÚMEN </w:t>
-      </w:r>
-      <w:r>
-        <w:rPr>
-          <w:rFonts w:ascii="Calibri" w:hAnsi="Calibri" w:cs="Arial"/>
-          <w:b/>
-          <w:bCs/>
-        </w:rPr>
-        <w:t>ENTREGAS</w:t>
-      </w:r>
-    </w:p>
-    <w:p>
-      <w:pPr>
-        <w:jc w:val="center"/>
-        <w:rPr>
-          <w:b/>
-          <w:bCs/>
-          <w:lang w:val="es-ES"/>
-        </w:rPr>
-      </w:pPr>
-      <w:r>
-        <w:rPr>
-          <w:b/>
-          <w:bCs/>
-          <w:lang w:val="es-ES"/>
-        </w:rPr>
-        <w:t xml:space="preserve">DEL </w:t>
-      </w:r>
-      <w:r>
-        <w:rPr>
-          <w:b/>
-          <w:bCs/>
-          <w:lang w:val="es-ES"/>
-        </w:rPr>
-        <w:t>{</w:t>
-      </w:r>
-      <w:r>
-        <w:rPr>
-          <w:b/>
-          <w:bCs/>
-          <w:lang w:val="es-ES"/>
-        </w:rPr>
-        <w:t>FECHA_INICIO</w:t>
-      </w:r>
-      <w:r>
-        <w:rPr>
-          <w:b/>
-          <w:bCs/>
-          <w:lang w:val="es-ES"/>
-        </w:rPr>
-        <w:t>}</w:t>
-      </w:r>
-      <w:r>
-        <w:rPr>
-          <w:b/>
-          <w:bCs/>
-          <w:lang w:val="es-ES"/>
-        </w:rPr>
-        <w:t xml:space="preserve"> AL </w:t>
-      </w:r>
-      <w:r>
-        <w:rPr>
-          <w:b/>
-          <w:bCs/>
-          <w:lang w:val="es-ES"/>
-        </w:rPr>
-        <w:t>{</w:t>
-      </w:r>
-      <w:r>
-        <w:rPr>
-          <w:b/>
-          <w:bCs/>
-          <w:lang w:val="es-ES"/>
-        </w:rPr>
-        <w:t>FECHA_FIN</w:t>
-      </w:r>
-      <w:r>
-        <w:rPr>
-          <w:b/>
-          <w:bCs/>
-          <w:lang w:val="es-ES"/>
-        </w:rPr>
-        <w:t>}</w:t>
-      </w:r>
-    </w:p>
-    <w:p>
-      <w:pPr>
-        <w:jc w:val="center"/>
-        <w:rPr>
-          <w:b/>
-          <w:bCs/>
-          <w:lang w:val="es-ES"/>
-        </w:rPr>
-      </w:pPr>
-    </w:p>
-    <w:p>
-      <w:pPr>
-        <w:jc w:val="center"/>
-        <w:rPr>
-          <w:b/>
-          <w:bCs/>
-          <w:lang w:val="es-ES"/>
-        </w:rPr>
-      </w:pPr>
-      <w:r>
-        <w:rPr>
-          <w:b/>
-          <w:bCs/>
-          <w:lang w:val="es-ES"/>
-        </w:rPr>
-        <w:t>{</w:t>
-      </w:r>
-      <w:r>
-        <w:rPr>
-          <w:b/>
-          <w:bCs/>
-          <w:lang w:val="es-ES"/>
-        </w:rPr>
-        <w:t>TABLA_ENTREGA</w:t>
-      </w:r>
-      <w:r>
-        <w:rPr>
-          <w:b/>
-          <w:bCs/>
-          <w:lang w:val="es-ES"/>
-        </w:rPr>
-        <w:t>}</w:t>
-      </w:r>
-    </w:p>
-    <w:p>
-      <w:pPr>
-        <w:jc w:val="center"/>
-        <w:rPr>
-          <w:b/>
-          <w:bCs/>
-          <w:lang w:val="es-ES"/>
-        </w:rPr>
-      </w:pPr>
-      <w:r>
-        <w:rPr>
-          <w:b/>
-          <w:bCs/>
-          <w:lang w:val="es-ES"/>
-        </w:rPr>
-        <w:t>{</w:t>
-      </w:r>
-      <w:r>
-        <w:rPr>
-          <w:b/>
-          <w:bCs/>
-          <w:lang w:val="es-ES"/>
-        </w:rPr>
-        <w:t>GRAFICO_ENTREGA</w:t>
-      </w:r>
-      <w:r>
-        <w:rPr>
-          <w:b/>
-          <w:bCs/>
-          <w:lang w:val="es-ES"/>
-        </w:rPr>
-        <w:t>}</w:t>
-      </w:r>
-    </w:p>
-    <w:p>
-      <w:pPr>
-        <w:jc w:val="center"/>
+          <w:b/>
+          <w:bCs/>
+          <w:lang w:val="es-ES"/>
+        </w:rPr>
+      </w:pPr>
+    </w:p>
+    <w:p>
+      <w:pPr>
         <w:rPr>
           <w:b/>
           <w:bCs/>

</xml_diff>